<commit_message>
Add Current identified gaps section to Significant Risk two-pager
Co-Authored-By: Claude Opus 5.5 <noreply@anthropic.com>
Claude-Session: https://claude.ai/code/session_01EdkzaTnSghY1TJ6qNv6HNP
</commit_message>
<xml_diff>
--- a/Significant_Risk_at_CKO_v2.docx
+++ b/Significant_Risk_at_CKO_v2.docx
@@ -3025,7 +3025,7 @@
           <w:sz w:val="23"/>
           <w:szCs w:val="23"/>
         </w:rPr>
-        <w:t xml:space="preserve">Appendix: current TM coverage and gaps (TF and Restricted countries)</w:t>
+        <w:t xml:space="preserve">Appendix: current TM coverage (TF and Restricted countries)</w:t>
       </w:r>
     </w:p>
     <w:tbl>
@@ -3042,8 +3042,7 @@
       </w:tblPr>
       <w:tblGrid>
         <w:gridCol w:w="1500"/>
-        <w:gridCol w:w="4200"/>
-        <w:gridCol w:w="3938"/>
+        <w:gridCol w:w="8138"/>
       </w:tblGrid>
       <w:tr>
         <w:trPr>
@@ -3085,7 +3084,7 @@
         </w:tc>
         <w:tc>
           <w:tcPr>
-            <w:tcW w:type="dxa" w:w="4200"/>
+            <w:tcW w:type="dxa" w:w="8138"/>
             <w:tcBorders>
               <w:top w:val="single" w:color="BFBFBF" w:sz="4"/>
               <w:left w:val="single" w:color="BFBFBF" w:sz="4"/>
@@ -3114,40 +3113,6 @@
                 <w:szCs w:val="16"/>
               </w:rPr>
               <w:t xml:space="preserve">Live TM rules</w:t>
-            </w:r>
-          </w:p>
-        </w:tc>
-        <w:tc>
-          <w:tcPr>
-            <w:tcW w:type="dxa" w:w="3938"/>
-            <w:tcBorders>
-              <w:top w:val="single" w:color="BFBFBF" w:sz="4"/>
-              <w:left w:val="single" w:color="BFBFBF" w:sz="4"/>
-              <w:bottom w:val="single" w:color="BFBFBF" w:sz="4"/>
-              <w:right w:val="single" w:color="BFBFBF" w:sz="4"/>
-            </w:tcBorders>
-            <w:shd w:fill="1F3864" w:color="auto" w:val="clear"/>
-            <w:tcMar>
-              <w:top w:type="dxa" w:w="50"/>
-              <w:left w:type="dxa" w:w="80"/>
-              <w:bottom w:type="dxa" w:w="50"/>
-              <w:right w:type="dxa" w:w="80"/>
-            </w:tcMar>
-          </w:tcPr>
-          <w:p>
-            <w:pPr>
-              <w:spacing w:after="40" w:line="230"/>
-            </w:pPr>
-            <w:r>
-              <w:rPr>
-                <w:rFonts w:ascii="Arial" w:cs="Arial" w:eastAsia="Arial" w:hAnsi="Arial"/>
-                <w:b/>
-                <w:bCs/>
-                <w:color w:val="FFFFFF"/>
-                <w:sz w:val="16"/>
-                <w:szCs w:val="16"/>
-              </w:rPr>
-              <w:t xml:space="preserve">Gaps</w:t>
             </w:r>
           </w:p>
         </w:tc>
@@ -3191,7 +3156,7 @@
         </w:tc>
         <w:tc>
           <w:tcPr>
-            <w:tcW w:type="dxa" w:w="4200"/>
+            <w:tcW w:type="dxa" w:w="8138"/>
             <w:tcBorders>
               <w:top w:val="single" w:color="BFBFBF" w:sz="4"/>
               <w:left w:val="single" w:color="BFBFBF" w:sz="4"/>
@@ -3255,62 +3220,6 @@
                 <w:szCs w:val="16"/>
               </w:rPr>
               <w:t xml:space="preserve">Near-threshold structuring (PayToBank, APM, Issuing); high-risk country share rules; Issuing cash-out outliers</w:t>
-            </w:r>
-          </w:p>
-        </w:tc>
-        <w:tc>
-          <w:tcPr>
-            <w:tcW w:type="dxa" w:w="3938"/>
-            <w:tcBorders>
-              <w:top w:val="single" w:color="BFBFBF" w:sz="4"/>
-              <w:left w:val="single" w:color="BFBFBF" w:sz="4"/>
-              <w:bottom w:val="single" w:color="BFBFBF" w:sz="4"/>
-              <w:right w:val="single" w:color="BFBFBF" w:sz="4"/>
-            </w:tcBorders>
-            <w:tcMar>
-              <w:top w:type="dxa" w:w="50"/>
-              <w:left w:type="dxa" w:w="80"/>
-              <w:bottom w:type="dxa" w:w="50"/>
-              <w:right w:type="dxa" w:w="80"/>
-            </w:tcMar>
-          </w:tcPr>
-          <w:p>
-            <w:pPr>
-              <w:spacing w:after="40" w:line="230"/>
-            </w:pPr>
-            <w:r>
-              <w:rPr>
-                <w:rFonts w:ascii="Arial" w:cs="Arial" w:eastAsia="Arial" w:hAnsi="Arial"/>
-                <w:sz w:val="16"/>
-                <w:szCs w:val="16"/>
-              </w:rPr>
-              <w:t xml:space="preserve">Most rules are value or share thresholds, so low-value TF can sit below them.</w:t>
-            </w:r>
-          </w:p>
-          <w:p>
-            <w:pPr>
-              <w:spacing w:after="40" w:line="230"/>
-            </w:pPr>
-            <w:r>
-              <w:rPr>
-                <w:rFonts w:ascii="Arial" w:cs="Arial" w:eastAsia="Arial" w:hAnsi="Arial"/>
-                <w:sz w:val="16"/>
-                <w:szCs w:val="16"/>
-              </w:rPr>
-              <w:t xml:space="preserve">No rule on charity or NPO payouts to High Risk or Restricted countries.</w:t>
-            </w:r>
-          </w:p>
-          <w:p>
-            <w:pPr>
-              <w:spacing w:after="40" w:line="230"/>
-            </w:pPr>
-            <w:r>
-              <w:rPr>
-                <w:rFonts w:ascii="Arial" w:cs="Arial" w:eastAsia="Arial" w:hAnsi="Arial"/>
-                <w:sz w:val="16"/>
-                <w:szCs w:val="16"/>
-              </w:rPr>
-              <w:t xml:space="preserve">TM cannot establish intent; name screening against UN and UAE terrorist lists sits outside TM.</w:t>
             </w:r>
           </w:p>
         </w:tc>
@@ -3354,7 +3263,7 @@
         </w:tc>
         <w:tc>
           <w:tcPr>
-            <w:tcW w:type="dxa" w:w="4200"/>
+            <w:tcW w:type="dxa" w:w="8138"/>
             <w:tcBorders>
               <w:top w:val="single" w:color="BFBFBF" w:sz="4"/>
               <w:left w:val="single" w:color="BFBFBF" w:sz="4"/>
@@ -3431,67 +3340,139 @@
                 <w:szCs w:val="16"/>
               </w:rPr>
               <w:t xml:space="preserve">Partial: payouts of $5,000+ to high-risk countries: PTC-ENT-ALL-ALL-MT-HRCShareAbove_v1</w:t>
-            </w:r>
-          </w:p>
-        </w:tc>
-        <w:tc>
-          <w:tcPr>
-            <w:tcW w:type="dxa" w:w="3938"/>
-            <w:tcBorders>
-              <w:top w:val="single" w:color="BFBFBF" w:sz="4"/>
-              <w:left w:val="single" w:color="BFBFBF" w:sz="4"/>
-              <w:bottom w:val="single" w:color="BFBFBF" w:sz="4"/>
-              <w:right w:val="single" w:color="BFBFBF" w:sz="4"/>
-            </w:tcBorders>
-            <w:tcMar>
-              <w:top w:type="dxa" w:w="50"/>
-              <w:left w:type="dxa" w:w="80"/>
-              <w:bottom w:type="dxa" w:w="50"/>
-              <w:right w:type="dxa" w:w="80"/>
-            </w:tcMar>
-          </w:tcPr>
-          <w:p>
-            <w:pPr>
-              <w:spacing w:after="40" w:line="230"/>
-            </w:pPr>
-            <w:r>
-              <w:rPr>
-                <w:rFonts w:ascii="Arial" w:cs="Arial" w:eastAsia="Arial" w:hAnsi="Arial"/>
-                <w:sz w:val="16"/>
-                <w:szCs w:val="16"/>
-              </w:rPr>
-              <w:t xml:space="preserve">No zero-tolerance Restricted-country rule for Card Acquiring, PayToCard or Issuing. PayToCard Rule #11 ("RestrictedCountry") only covers Unacceptable countries.</w:t>
-            </w:r>
-          </w:p>
-          <w:p>
-            <w:pPr>
-              <w:spacing w:after="40" w:line="230"/>
-            </w:pPr>
-            <w:r>
-              <w:rPr>
-                <w:rFonts w:ascii="Arial" w:cs="Arial" w:eastAsia="Arial" w:hAnsi="Arial"/>
-                <w:sz w:val="16"/>
-                <w:szCs w:val="16"/>
-              </w:rPr>
-              <w:t xml:space="preserve">Card Acquiring uses the issuing country, not traffic origin (IP).</w:t>
-            </w:r>
-          </w:p>
-          <w:p>
-            <w:pPr>
-              <w:spacing w:after="40" w:line="230"/>
-            </w:pPr>
-            <w:r>
-              <w:rPr>
-                <w:rFonts w:ascii="Arial" w:cs="Arial" w:eastAsia="Arial" w:hAnsi="Arial"/>
-                <w:sz w:val="16"/>
-                <w:szCs w:val="16"/>
-              </w:rPr>
-              <w:t xml:space="preserve">The PayToBank rule runs weekly; the daily single-transaction rule (ptb_single_003) is deactivated.</w:t>
             </w:r>
           </w:p>
         </w:tc>
       </w:tr>
     </w:tbl>
+    <w:p>
+      <w:pPr>
+        <w:pStyle w:val="Heading2"/>
+        <w:pBdr>
+          <w:bottom w:val="single" w:color="BFBFBF" w:sz="4" w:space="2"/>
+        </w:pBdr>
+        <w:spacing w:after="80" w:before="180"/>
+      </w:pPr>
+      <w:r>
+        <w:rPr>
+          <w:rFonts w:ascii="Arial" w:cs="Arial" w:eastAsia="Arial" w:hAnsi="Arial"/>
+          <w:b/>
+          <w:bCs/>
+          <w:color w:val="1F3864"/>
+          <w:sz w:val="23"/>
+          <w:szCs w:val="23"/>
+        </w:rPr>
+        <w:t xml:space="preserve">Current identified gaps</w:t>
+      </w:r>
+    </w:p>
+    <w:p>
+      <w:pPr>
+        <w:pStyle w:val="ListParagraph"/>
+        <w:numPr>
+          <w:ilvl w:val="0"/>
+          <w:numId w:val="2"/>
+        </w:numPr>
+        <w:spacing w:after="40" w:line="250"/>
+      </w:pPr>
+      <w:r>
+        <w:rPr>
+          <w:rFonts w:ascii="Arial" w:cs="Arial" w:eastAsia="Arial" w:hAnsi="Arial"/>
+          <w:sz w:val="19"/>
+          <w:szCs w:val="19"/>
+        </w:rPr>
+        <w:t xml:space="preserve">Most rules are value or share thresholds, so low-value TF can sit below them.</w:t>
+      </w:r>
+    </w:p>
+    <w:p>
+      <w:pPr>
+        <w:pStyle w:val="ListParagraph"/>
+        <w:numPr>
+          <w:ilvl w:val="0"/>
+          <w:numId w:val="2"/>
+        </w:numPr>
+        <w:spacing w:after="40" w:line="250"/>
+      </w:pPr>
+      <w:r>
+        <w:rPr>
+          <w:rFonts w:ascii="Arial" w:cs="Arial" w:eastAsia="Arial" w:hAnsi="Arial"/>
+          <w:sz w:val="19"/>
+          <w:szCs w:val="19"/>
+        </w:rPr>
+        <w:t xml:space="preserve">No rule on charity or NPO payouts to high-risk or Restricted countries.</w:t>
+      </w:r>
+    </w:p>
+    <w:p>
+      <w:pPr>
+        <w:pStyle w:val="ListParagraph"/>
+        <w:numPr>
+          <w:ilvl w:val="0"/>
+          <w:numId w:val="2"/>
+        </w:numPr>
+        <w:spacing w:after="40" w:line="250"/>
+      </w:pPr>
+      <w:r>
+        <w:rPr>
+          <w:rFonts w:ascii="Arial" w:cs="Arial" w:eastAsia="Arial" w:hAnsi="Arial"/>
+          <w:sz w:val="19"/>
+          <w:szCs w:val="19"/>
+        </w:rPr>
+        <w:t xml:space="preserve">TM cannot establish intent. Name screening against UN and UAE terrorist lists sits outside TM.</w:t>
+      </w:r>
+    </w:p>
+    <w:p>
+      <w:pPr>
+        <w:pStyle w:val="ListParagraph"/>
+        <w:numPr>
+          <w:ilvl w:val="0"/>
+          <w:numId w:val="2"/>
+        </w:numPr>
+        <w:spacing w:after="40" w:line="250"/>
+      </w:pPr>
+      <w:r>
+        <w:rPr>
+          <w:rFonts w:ascii="Arial" w:cs="Arial" w:eastAsia="Arial" w:hAnsi="Arial"/>
+          <w:sz w:val="19"/>
+          <w:szCs w:val="19"/>
+        </w:rPr>
+        <w:t xml:space="preserve">No zero-tolerance Restricted-country rule for Card Acquiring, PayToCard or Issuing. PayToCard Rule #11 ("RestrictedCountry") only covers Unacceptable countries.</w:t>
+      </w:r>
+    </w:p>
+    <w:p>
+      <w:pPr>
+        <w:pStyle w:val="ListParagraph"/>
+        <w:numPr>
+          <w:ilvl w:val="0"/>
+          <w:numId w:val="2"/>
+        </w:numPr>
+        <w:spacing w:after="40" w:line="250"/>
+      </w:pPr>
+      <w:r>
+        <w:rPr>
+          <w:rFonts w:ascii="Arial" w:cs="Arial" w:eastAsia="Arial" w:hAnsi="Arial"/>
+          <w:sz w:val="19"/>
+          <w:szCs w:val="19"/>
+        </w:rPr>
+        <w:t xml:space="preserve">Card Acquiring uses the issuing country, not traffic origin (IP).</w:t>
+      </w:r>
+    </w:p>
+    <w:p>
+      <w:pPr>
+        <w:pStyle w:val="ListParagraph"/>
+        <w:numPr>
+          <w:ilvl w:val="0"/>
+          <w:numId w:val="2"/>
+        </w:numPr>
+        <w:spacing w:after="40" w:line="250"/>
+      </w:pPr>
+      <w:r>
+        <w:rPr>
+          <w:rFonts w:ascii="Arial" w:cs="Arial" w:eastAsia="Arial" w:hAnsi="Arial"/>
+          <w:sz w:val="19"/>
+          <w:szCs w:val="19"/>
+        </w:rPr>
+        <w:t xml:space="preserve">The PayToBank rule runs weekly. The daily single-transaction rule (ptb_single_003) is deactivated.</w:t>
+      </w:r>
+    </w:p>
     <w:sectPr>
       <w:footerReference w:type="default" r:id="rId7"/>
       <w:pgSz w:w="11906" w:h="16838" w:orient="portrait"/>
@@ -3716,6 +3697,12 @@
       <w:startOverride w:val="1"/>
     </w:lvlOverride>
   </w:num>
+  <w:num w:numId="2">
+    <w:abstractNumId w:val="2"/>
+    <w:lvlOverride w:ilvl="0">
+      <w:startOverride w:val="1"/>
+    </w:lvlOverride>
+  </w:num>
 </w:numbering>
 </file>
 

</xml_diff>